<commit_message>
PBPAM Bab 1-2: selaraskan narasi dengan lampiran data kualitas air
- Latar belakang: kekeruhan tidak punya baku mutu Kelas I (melampaui standar air minum);
  TDS ditambahkan ke daftar parameter yang melebihi Kelas I
- 2.1.5 b: Zn terdeteksi 0,0203 mg/L (bukan di bawah limit deteksi), masih < 0,05

Co-Authored-By: Claude Opus 5.5 <noreply@anthropic.com>
Claude-Session: https://claude.ai/code/session_01WytFq486GaBDwZ7CZLwu8n
</commit_message>
<xml_diff>
--- a/pbpam/TUBES_PBPAM_Bab2.docx
+++ b/pbpam/TUBES_PBPAM_Bab2.docx
@@ -184,7 +184,7 @@
           <w:szCs w:val="24"/>
           <w:rtl w:val="0"/>
         </w:rPr>
-        <w:t xml:space="preserve">Di sisi lain, karakter Tukad Mati sebagai penerima buangan drainase perkotaan membuat kualitas airnya menjadi isu utama. Hasil uji kualitas air pada tahun 2024 dan 2025 menunjukkan bahwa beberapa parameter kunci, yaitu amonia (NH₃-N), BOD₅, COD, total fosfat, nitrit, mangan, dan kekeruhan, tidak memenuhi baku mutu air Kelas I menurut PP Nomor 22 Tahun 2021, disertai kandungan oksigen terlarut (DO) yang rendah. Kondisi ini menuntut rangkaian pengolahan yang lebih lengkap dibandingkan pengolahan konvensional biasa, khususnya pada tahap pra-pengolahan untuk menurunkan beban organik dan amonia sebelum masuk ke unit pengolahan utama.</w:t>
+        <w:t xml:space="preserve">Di sisi lain, karakter Tukad Mati sebagai penerima buangan drainase perkotaan membuat kualitas airnya menjadi isu utama. Hasil uji kualitas air pada tahun 2024 dan 2025 menunjukkan bahwa beberapa parameter kunci, yaitu amonia (NH₃-N), BOD₅, COD, total fosfat, nitrit, mangan, dan TDS, tidak memenuhi baku mutu air Kelas I menurut PP Nomor 22 Tahun 2021, disertai kandungan oksigen terlarut (DO) yang rendah serta kekeruhan yang melampaui standar air minum. Kondisi ini menuntut rangkaian pengolahan yang lebih lengkap dibandingkan pengolahan konvensional biasa, khususnya pada tahap pra-pengolahan untuk menurunkan beban organik dan amonia sebelum masuk ke unit pengolahan utama.</w:t>
       </w:r>
     </w:p>
     <w:p>
@@ -13645,7 +13645,7 @@
           <w:sz w:val="24"/>
           <w:szCs w:val="24"/>
         </w:rPr>
-        <w:t xml:space="preserve">Kandungan besi masih memenuhi baku mutu, namun mangan mencapai 0,3 mg/L atau tiga kali baku mutu Kelas I sekaligus melampaui standar air minum sebesar 0,1 mg/L. Mangan terlarut perlu dioksidasi menjadi mangan dioksida (MnO₂) yang tidak terlarut sebelum dapat dipisahkan pada sedimentasi dan filtrasi. Karena laju oksidasi mangan oleh udara lambat pada pH netral, aerasi didukung oleh pembubuhan kalium permanganat (KMnO₄) pada inlet koagulasi bila kadar mangan melebihi 0,1 mg/L. Seluruh parameter logam berat (Cd, Pb, Hg, Cr⁶⁺, Cu, Zn) berada di bawah limit deteksi sehingga tidak memerlukan unit pengolahan khusus.</w:t>
+        <w:t xml:space="preserve">Kandungan besi masih memenuhi baku mutu, namun mangan mencapai 0,3 mg/L atau tiga kali baku mutu Kelas I sekaligus melampaui standar air minum sebesar 0,1 mg/L. Mangan terlarut perlu dioksidasi menjadi mangan dioksida (MnO₂) yang tidak terlarut sebelum dapat dipisahkan pada sedimentasi dan filtrasi. Karena laju oksidasi mangan oleh udara lambat pada pH netral, aerasi didukung oleh pembubuhan kalium permanganat (KMnO₄) pada inlet koagulasi bila kadar mangan melebihi 0,1 mg/L. Parameter logam berat Cd, Pb, Hg, Cr⁶⁺, dan Cu berada di bawah limit deteksi, sedangkan Zn terdeteksi sebesar 0,0203 mg/L tetapi masih di bawah baku mutu Kelas I (0,05 mg/L), sehingga tidak memerlukan unit pengolahan khusus.</w:t>
       </w:r>
     </w:p>
     <w:p>

</xml_diff>

<commit_message>
PBPAM Bab 2: justifikasi pra-sedimentasi (SNI 7508:2011) dan perbaikan rujukan tabel
- 2.3.3.1: pra-sedimentasi umumnya untuk kekeruhan > 600 NTU; tetap dipasang sebagai
  penyangga muatan sedimen musim hujan (data 14 NTU hanya musim kemarau)
- 2.2.1: Q90 dirujuk ke Tabel 2.7 (sebelumnya salah ke Tabel 2.6)
- Kepustakaan: tambah Ananto et al. (2023)

Co-Authored-By: Claude Opus 5.5 <noreply@anthropic.com>
Claude-Session: https://claude.ai/code/session_01WytFq486GaBDwZ7CZLwu8n
</commit_message>
<xml_diff>
--- a/pbpam/TUBES_PBPAM_Bab2.docx
+++ b/pbpam/TUBES_PBPAM_Bab2.docx
@@ -15690,7 +15690,7 @@
           <w:sz w:val="24"/>
           <w:szCs w:val="24"/>
         </w:rPr>
-        <w:t xml:space="preserve">Catatan: data debit Tukad Mati (data pos duga air BWS Bali-Penida atau hasil perhitungan F.J. Mock) belum tersedia dan perlu dilengkapi untuk mengisi nilai Q₉₀ pada Tabel 2.6.</w:t>
+        <w:t xml:space="preserve">Catatan: data debit Tukad Mati (data pos duga air BWS Bali-Penida atau hasil perhitungan F.J. Mock) belum tersedia dan perlu dilengkapi untuk mengisi nilai Q₉₀ pada Tabel 2.7.</w:t>
       </w:r>
     </w:p>
     <w:p>
@@ -20731,7 +20731,7 @@
           <w:sz w:val="24"/>
           <w:szCs w:val="24"/>
         </w:rPr>
-        <w:t xml:space="preserve">Pra-sedimentasi merupakan bak pengendap pertama yang berfungsi memisahkan partikel diskrit seperti pasir, lanau, dan padatan kasar secara gravitasi tanpa pembubuhan bahan kimia. Unit ini melindungi unit-unit berikutnya dari beban padatan tinggi, terutama pada musim hujan ketika kekeruhan sungai meningkat tajam, sekaligus menurunkan kebutuhan koagulan.</w:t>
+        <w:t xml:space="preserve">Pra-sedimentasi merupakan bak pengendap pertama yang berfungsi memisahkan partikel diskrit seperti pasir, lanau, dan padatan kasar secara gravitasi tanpa pembubuhan bahan kimia. Unit ini melindungi unit-unit berikutnya dari beban padatan tinggi, terutama pada musim hujan ketika kekeruhan sungai meningkat tajam, sekaligus menurunkan kebutuhan koagulan. Menurut SNI 7508:2011, unit pra-sedimentasi umumnya diperlukan apabila kekeruhan air baku melebihi 600 NTU (Ananto et al., 2023). Kekeruhan Tukad Mati yang terukur sebesar 14 NTU masih jauh di bawah nilai tersebut, tetapi data ini hanya mewakili musim kemarau. Oleh karena itu, pra-sedimentasi tetap direncanakan sebagai unit penyangga terhadap lonjakan muatan sedimen pada musim hujan akibat limpasan kawasan terbangun di sepanjang DAS Tukad Mati.</w:t>
       </w:r>
     </w:p>
     <w:p>
@@ -39012,6 +39012,39 @@
           <w:szCs w:val="24"/>
         </w:rPr>
         <w:t xml:space="preserve">2.4 Kepustakaan Bab 2</w:t>
+      </w:r>
+    </w:p>
+    <w:p>
+      <w:pPr>
+        <w:spacing w:after="160" w:line="240" w:lineRule="auto"/>
+        <w:ind w:left="720" w:hanging="720"/>
+        <w:jc w:val="both"/>
+      </w:pPr>
+      <w:r>
+        <w:rPr>
+          <w:rFonts w:ascii="Times New Roman" w:cs="Times New Roman" w:eastAsia="Times New Roman" w:hAnsi="Times New Roman"/>
+          <w:sz w:val="24"/>
+          <w:szCs w:val="24"/>
+        </w:rPr>
+        <w:t xml:space="preserve">Ananto, M. R., Hadisoebroto, R., &amp; Winarni. (2023). Perencanaan Instalasi Pengolahan Air Minum di Kecamatan Pondok Gede, Kota Bekasi. </w:t>
+      </w:r>
+      <w:r>
+        <w:rPr>
+          <w:rFonts w:ascii="Times New Roman" w:cs="Times New Roman" w:eastAsia="Times New Roman" w:hAnsi="Times New Roman"/>
+          <w:i w:val="1"/>
+          <w:iCs w:val="1"/>
+          <w:sz w:val="24"/>
+          <w:szCs w:val="24"/>
+        </w:rPr>
+        <w:t xml:space="preserve">Jurnal Lingkungan dan Sumberdaya Alam (JURNALIS)</w:t>
+      </w:r>
+      <w:r>
+        <w:rPr>
+          <w:rFonts w:ascii="Times New Roman" w:cs="Times New Roman" w:eastAsia="Times New Roman" w:hAnsi="Times New Roman"/>
+          <w:sz w:val="24"/>
+          <w:szCs w:val="24"/>
+        </w:rPr>
+        <w:t xml:space="preserve">, 6(1), 91–104. https://doi.org/10.47080/jls.v6i1.2485</w:t>
       </w:r>
     </w:p>
     <w:p>

</xml_diff>

<commit_message>
PBPAM Bab 1-2: luas DAS, satuan nitrat/nitrit Permenkes, konsep amonia
- DAS: 38,42 km2 (Ardana dkk., 2021) untuk hidrologi; 39,43 km2 disebut sbg angka PUPR;
  DOI ditambahkan pada pustaka Ardana
- Permenkes 2/2023 menyatakan nitrat/nitrit sebagai ion: batas setara 4,52 mg/L NO3-N
  dan 0,91 mg/L NO2-N; Tabel 2.2-2.5 dan narasi diselaraskan (keduanya melebihi air minum)
- Amonia: desain rutin 2 mg/L NH3-N, 7,742 sebagai kondisi puncak; biofilter tidak dipilih
  karena nitrifikasi menambah nitrat; target NH3 <= 1,5 mg/L (parameter khusus)
- Blending/RO juga sebagai pengendali nitrat

Co-Authored-By: Claude Opus 5.5 <noreply@anthropic.com>
Claude-Session: https://claude.ai/code/session_01WytFq486GaBDwZ7CZLwu8n
</commit_message>
<xml_diff>
--- a/pbpam/TUBES_PBPAM_Bab2.docx
+++ b/pbpam/TUBES_PBPAM_Bab2.docx
@@ -163,7 +163,7 @@
           <w:szCs w:val="24"/>
           <w:rtl w:val="0"/>
         </w:rPr>
-        <w:t xml:space="preserve">Tukad Mati merupakan salah satu sungai yang melintasi Kota Denpasar dan Kabupaten Badung dengan luas Daerah Aliran Sungai (DAS) 39,43 km² dan panjang sungai utama 22,49 km, serta melewati kawasan Kuta, Seminyak, dan Legian. Sungai ini berfungsi utama sebagai drainase wilayah perkotaan sehingga alirannya relatif kontinu sepanjang tahun. Sungai ini juga telah tertata melalui program normalisasi dan pengendalian banjir oleh Kementerian Pekerjaan Umum dan Perumahan Rakyat, sehingga secara teknis lebih memungkinkan untuk dibangun bangunan pengambilan (intake).</w:t>
+        <w:t xml:space="preserve">Tukad Mati merupakan salah satu sungai yang melintasi Kota Denpasar dan Kabupaten Badung dengan luas Daerah Aliran Sungai (DAS) ± 39,43 km² dan panjang sungai utama 22,49 km menurut Kementerian PUPR, serta melewati kawasan Kuta, Seminyak, dan Legian. Sungai ini berfungsi utama sebagai drainase wilayah perkotaan sehingga alirannya relatif kontinu sepanjang tahun. Sungai ini juga telah tertata melalui program normalisasi dan pengendalian banjir oleh Kementerian Pekerjaan Umum dan Perumahan Rakyat, sehingga secara teknis lebih memungkinkan untuk dibangun bangunan pengambilan (intake).</w:t>
       </w:r>
     </w:p>
     <w:p>
@@ -3040,7 +3040,7 @@
                 <w:sz w:val="20"/>
                 <w:szCs w:val="20"/>
               </w:rPr>
-              <w:t xml:space="preserve">20</w:t>
+              <w:t xml:space="preserve">20 sbg NO₃ (≈ 4,52 sbg N)</w:t>
             </w:r>
           </w:p>
         </w:tc>
@@ -3175,7 +3175,7 @@
                 <w:sz w:val="20"/>
                 <w:szCs w:val="20"/>
               </w:rPr>
-              <w:t xml:space="preserve">3</w:t>
+              <w:t xml:space="preserve">3 sbg NO₂ (≈ 0,91 sbg N)</w:t>
             </w:r>
           </w:p>
         </w:tc>
@@ -4301,6 +4301,21 @@
           <w:szCs w:val="22"/>
         </w:rPr>
         <w:t xml:space="preserve">Sumber: PP No. 22 Tahun 2021 dan Permenkes No. 2 Tahun 2023</w:t>
+      </w:r>
+    </w:p>
+    <w:p>
+      <w:pPr>
+        <w:spacing w:after="120" w:line="360" w:lineRule="auto"/>
+        <w:ind w:left="720" w:firstLine="720"/>
+        <w:jc w:val="both"/>
+      </w:pPr>
+      <w:r>
+        <w:rPr>
+          <w:rFonts w:ascii="Times New Roman" w:cs="Times New Roman" w:eastAsia="Times New Roman" w:hAnsi="Times New Roman"/>
+          <w:sz w:val="24"/>
+          <w:szCs w:val="24"/>
+        </w:rPr>
+        <w:t xml:space="preserve">PP 22/2021 menyatakan nitrat dan nitrit sebagai nitrogen (NO₃-N dan NO₂-N), sedangkan Permenkes 2/2023 menyatakannya sebagai ion (NO₃ dan NO₂). Konversi satuan dilakukan dengan NO₃-N = NO₃ × 14/62 dan NO₂-N = NO₂ × 14/46, sehingga batas air minum 20 mg/L NO₃ setara 4,52 mg/L NO₃-N dan batas 3 mg/L NO₂ setara 0,91 mg/L NO₂-N. Seluruh perbandingan nitrat dan nitrit dalam laporan ini menggunakan satuan nitrogen.</w:t>
       </w:r>
     </w:p>
     <w:p>
@@ -11082,7 +11097,7 @@
                 <w:sz w:val="18"/>
                 <w:szCs w:val="18"/>
               </w:rPr>
-              <w:t xml:space="preserve">20</w:t>
+              <w:t xml:space="preserve">20 sbg NO₃ (≈ 4,52 sbg N)</w:t>
             </w:r>
           </w:p>
         </w:tc>
@@ -11186,7 +11201,7 @@
                 <w:sz w:val="18"/>
                 <w:szCs w:val="18"/>
               </w:rPr>
-              <w:t xml:space="preserve">Memenuhi</w:t>
+              <w:t xml:space="preserve">Memenuhi Kelas I; melebihi standar air minum</w:t>
             </w:r>
           </w:p>
         </w:tc>
@@ -11295,7 +11310,7 @@
                 <w:sz w:val="18"/>
                 <w:szCs w:val="18"/>
               </w:rPr>
-              <w:t xml:space="preserve">3</w:t>
+              <w:t xml:space="preserve">3 sbg NO₂ (≈ 0,91 sbg N)</w:t>
             </w:r>
           </w:p>
         </w:tc>
@@ -11399,7 +11414,7 @@
                 <w:sz w:val="18"/>
                 <w:szCs w:val="18"/>
               </w:rPr>
-              <w:t xml:space="preserve">Melebihi</w:t>
+              <w:t xml:space="preserve">Melebihi (juga standar air minum)</w:t>
             </w:r>
           </w:p>
         </w:tc>
@@ -12072,7 +12087,7 @@
           <w:sz w:val="24"/>
           <w:szCs w:val="24"/>
         </w:rPr>
-        <w:t xml:space="preserve">Berdasarkan Tabel 2.3, terdapat delapan parameter yang tidak memenuhi baku mutu Kelas I, yaitu TDS, amonia, BOD₅, COD, DO, mangan, total fosfat, dan nitrit. Selain itu, kekeruhan tidak memiliki baku mutu Kelas I tetapi melampaui standar air minum. Rekapitulasi parameter kritis beserta implikasinya terhadap konsep pengolahan disajikan pada Tabel 2.4.</w:t>
+        <w:t xml:space="preserve">Berdasarkan Tabel 2.3, terdapat delapan parameter yang tidak memenuhi baku mutu Kelas I, yaitu TDS, amonia, BOD₅, COD, DO, mangan, total fosfat, dan nitrit. Selain itu, kekeruhan tidak memiliki baku mutu Kelas I tetapi melampaui standar air minum. Setelah satuan disetarakan, nitrit (2 mg/L NO₂-N) dan nitrat (5 mg/L NO₃-N) juga melampaui standar air minum. Rekapitulasi parameter kritis beserta implikasinya terhadap konsep pengolahan disajikan pada Tabel 2.4.</w:t>
       </w:r>
     </w:p>
     <w:p>
@@ -12395,7 +12410,7 @@
                 <w:sz w:val="20"/>
                 <w:szCs w:val="20"/>
               </w:rPr>
-              <w:t xml:space="preserve">Parameter paling kritis. Disisihkan melalui nitrifikasi biologis pada media filter (memerlukan suplai DO dari aerasi) dan </w:t>
+              <w:t xml:space="preserve">Parameter paling kritis. Desain rutin ± 2 mg/L (nitrifikasi di filter ± 1,2 mg/L + </w:t>
             </w:r>
             <w:r>
               <w:rPr>
@@ -12413,7 +12428,7 @@
                 <w:sz w:val="20"/>
                 <w:szCs w:val="20"/>
               </w:rPr>
-              <w:t xml:space="preserve"> pada unit desinfeksi</w:t>
+              <w:t xml:space="preserve">); 7,742 mg/L diperlakukan sebagai kondisi puncak</w:t>
             </w:r>
           </w:p>
         </w:tc>
@@ -13223,7 +13238,142 @@
                 <w:sz w:val="20"/>
                 <w:szCs w:val="20"/>
               </w:rPr>
-              <w:t xml:space="preserve">Teroksidasi menjadi nitrat pada aerasi, filter biologis, dan klorinasi; menambah kebutuhan klor</w:t>
+              <w:t xml:space="preserve">Melampaui juga standar air minum (0,91 mg/L NO₂-N); teroksidasi menjadi nitrat pada aerasi, filter, dan klorinasi; menambah kebutuhan klor</w:t>
+            </w:r>
+          </w:p>
+        </w:tc>
+      </w:tr>
+      <w:tr>
+        <w:trPr>
+          <w:cantSplit w:val="1"/>
+        </w:trPr>
+        <w:tc>
+          <w:tcPr>
+            <w:tcW w:w="1500" w:type="dxa"/>
+            <w:tcMar>
+              <w:top w:w="50" w:type="dxa"/>
+              <w:left w:w="70" w:type="dxa"/>
+              <w:bottom w:w="50" w:type="dxa"/>
+              <w:right w:w="70" w:type="dxa"/>
+            </w:tcMar>
+            <w:vAlign w:val="center"/>
+          </w:tcPr>
+          <w:p>
+            <w:pPr>
+              <w:spacing w:after="0" w:line="240" w:lineRule="auto"/>
+              <w:jc w:val="left"/>
+            </w:pPr>
+            <w:r>
+              <w:rPr>
+                <w:rFonts w:ascii="Times New Roman" w:cs="Times New Roman" w:eastAsia="Times New Roman" w:hAnsi="Times New Roman"/>
+                <w:sz w:val="20"/>
+                <w:szCs w:val="20"/>
+              </w:rPr>
+              <w:t xml:space="preserve">Nitrat (NO₃-N)</w:t>
+            </w:r>
+          </w:p>
+        </w:tc>
+        <w:tc>
+          <w:tcPr>
+            <w:tcW w:w="1100" w:type="dxa"/>
+            <w:tcMar>
+              <w:top w:w="50" w:type="dxa"/>
+              <w:left w:w="70" w:type="dxa"/>
+              <w:bottom w:w="50" w:type="dxa"/>
+              <w:right w:w="70" w:type="dxa"/>
+            </w:tcMar>
+            <w:vAlign w:val="center"/>
+          </w:tcPr>
+          <w:p>
+            <w:pPr>
+              <w:spacing w:after="0" w:line="240" w:lineRule="auto"/>
+              <w:jc w:val="center"/>
+            </w:pPr>
+            <w:r>
+              <w:rPr>
+                <w:rFonts w:ascii="Times New Roman" w:cs="Times New Roman" w:eastAsia="Times New Roman" w:hAnsi="Times New Roman"/>
+                <w:sz w:val="20"/>
+                <w:szCs w:val="20"/>
+              </w:rPr>
+              <w:t xml:space="preserve">5 mg/L</w:t>
+            </w:r>
+          </w:p>
+        </w:tc>
+        <w:tc>
+          <w:tcPr>
+            <w:tcW w:w="1050" w:type="dxa"/>
+            <w:tcMar>
+              <w:top w:w="50" w:type="dxa"/>
+              <w:left w:w="70" w:type="dxa"/>
+              <w:bottom w:w="50" w:type="dxa"/>
+              <w:right w:w="70" w:type="dxa"/>
+            </w:tcMar>
+            <w:vAlign w:val="center"/>
+          </w:tcPr>
+          <w:p>
+            <w:pPr>
+              <w:spacing w:after="0" w:line="240" w:lineRule="auto"/>
+              <w:jc w:val="center"/>
+            </w:pPr>
+            <w:r>
+              <w:rPr>
+                <w:rFonts w:ascii="Times New Roman" w:cs="Times New Roman" w:eastAsia="Times New Roman" w:hAnsi="Times New Roman"/>
+                <w:sz w:val="20"/>
+                <w:szCs w:val="20"/>
+              </w:rPr>
+              <w:t xml:space="preserve">10 mg/L (air minum 4,52)</w:t>
+            </w:r>
+          </w:p>
+        </w:tc>
+        <w:tc>
+          <w:tcPr>
+            <w:tcW w:w="850" w:type="dxa"/>
+            <w:tcMar>
+              <w:top w:w="50" w:type="dxa"/>
+              <w:left w:w="70" w:type="dxa"/>
+              <w:bottom w:w="50" w:type="dxa"/>
+              <w:right w:w="70" w:type="dxa"/>
+            </w:tcMar>
+            <w:vAlign w:val="center"/>
+          </w:tcPr>
+          <w:p>
+            <w:pPr>
+              <w:spacing w:after="0" w:line="240" w:lineRule="auto"/>
+              <w:jc w:val="center"/>
+            </w:pPr>
+            <w:r>
+              <w:rPr>
+                <w:rFonts w:ascii="Times New Roman" w:cs="Times New Roman" w:eastAsia="Times New Roman" w:hAnsi="Times New Roman"/>
+                <w:sz w:val="20"/>
+                <w:szCs w:val="20"/>
+              </w:rPr>
+              <w:t xml:space="preserve">± 1,1× (air minum)</w:t>
+            </w:r>
+          </w:p>
+        </w:tc>
+        <w:tc>
+          <w:tcPr>
+            <w:tcW w:w="4515" w:type="dxa"/>
+            <w:tcMar>
+              <w:top w:w="50" w:type="dxa"/>
+              <w:left w:w="70" w:type="dxa"/>
+              <w:bottom w:w="50" w:type="dxa"/>
+              <w:right w:w="70" w:type="dxa"/>
+            </w:tcMar>
+            <w:vAlign w:val="center"/>
+          </w:tcPr>
+          <w:p>
+            <w:pPr>
+              <w:spacing w:after="0" w:line="240" w:lineRule="auto"/>
+              <w:jc w:val="left"/>
+            </w:pPr>
+            <w:r>
+              <w:rPr>
+                <w:rFonts w:ascii="Times New Roman" w:cs="Times New Roman" w:eastAsia="Times New Roman" w:hAnsi="Times New Roman"/>
+                <w:sz w:val="20"/>
+                <w:szCs w:val="20"/>
+              </w:rPr>
+              <w:t xml:space="preserve">Tidak tersisihkan pengolahan konvensional dan bertambah akibat oksidasi nitrit serta nitrifikasi; dikendalikan melalui blending sebelum distribusi</w:t>
             </w:r>
           </w:p>
         </w:tc>
@@ -13544,7 +13694,7 @@
           <w:sz w:val="24"/>
           <w:szCs w:val="24"/>
         </w:rPr>
-        <w:t xml:space="preserve">Kadar amonia, BOD₅, COD, dan total fosfat yang tinggi disertai DO yang rendah menunjukkan bahwa Tukad Mati menerima beban limbah domestik yang signifikan. Amonia sebesar 7,742 mg/L pada pengukuran Oktober 2024 merupakan parameter paling kritis. Dampak utamanya terdapat pada tahap desinfeksi: klor akan bereaksi terlebih dahulu dengan amonia membentuk kloramin sebelum tersedia sebagai sisa klor bebas. Secara stoikiometri, kebutuhan klor untuk mencapai titik </w:t>
+        <w:t xml:space="preserve">Kadar amonia, BOD₅, COD, dan total fosfat yang tinggi disertai DO yang rendah menunjukkan bahwa Tukad Mati menerima beban limbah domestik yang signifikan. Amonia merupakan parameter paling kritis, dengan nilai 7,742 mg/L pada Oktober 2024 dan 1,794 mg/L pada Juni 2025. Dampak utamanya terdapat pada tahap desinfeksi: klor bereaksi terlebih dahulu dengan amonia membentuk kloramin sebelum tersedia sebagai sisa klor bebas. Kebutuhan klor untuk mencapai </w:t>
       </w:r>
       <w:r>
         <w:rPr>
@@ -13562,7 +13712,7 @@
           <w:sz w:val="24"/>
           <w:szCs w:val="24"/>
         </w:rPr>
-        <w:t xml:space="preserve"> sekitar 7,6 mg Cl₂ per mg NH₃-N, sehingga pada kadar 7,742 mg/L kebutuhan klor dapat mencapai ± 59 mg/L. Nilai ini tidak ekonomis dan berisiko tinggi membentuk DBPs.</w:t>
+        <w:t xml:space="preserve"> sekitar 7,6 mg Cl₂ per mg NH₃-N, sehingga apabila amonia 7,742 mg/L seluruhnya diselesaikan dengan klorinasi, kebutuhan klor mencapai ± 59 mg/L. Nilai ini tidak ekonomis dan berisiko tinggi membentuk DBPs.</w:t>
       </w:r>
     </w:p>
     <w:p>
@@ -13577,7 +13727,7 @@
           <w:sz w:val="24"/>
           <w:szCs w:val="24"/>
         </w:rPr>
-        <w:t xml:space="preserve">Perlu ditegaskan bahwa aerasi pada pH netral (pH air baku 7–7,7) tidak efektif melepaskan amonia ke udara karena </w:t>
+        <w:t xml:space="preserve">Aerasi pada pH netral (pH air baku 7–7,7) tidak efektif melepaskan amonia ke udara karena </w:t>
       </w:r>
       <w:r>
         <w:rPr>
@@ -13595,7 +13745,7 @@
           <w:sz w:val="24"/>
           <w:szCs w:val="24"/>
         </w:rPr>
-        <w:t xml:space="preserve"> amonia baru efektif pada pH di atas 10,5. Oleh karena itu, konsep penyisihan amonia dalam perencanaan ini dilakukan secara bertahap, yaitu: (1) aerasi untuk menaikkan DO; (2) nitrifikasi biologis pada media saringan pasir cepat yang dioperasikan tanpa klorinasi pendahuluan, sehingga bakteri nitrifikasi dapat tumbuh pada permukaan media; dan (3) </w:t>
+        <w:t xml:space="preserve"> amonia baru efektif pada pH di atas 10,5. Oleh karena itu, penyisihan amonia dilakukan secara bertahap, yaitu: (1) aerasi untuk menaikkan DO; (2) nitrifikasi biologis pada media saringan pasir cepat yang dioperasikan tanpa klorinasi pendahuluan, sehingga bakteri nitrifikasi dapat tumbuh pada permukaan media; dan (3) </w:t>
       </w:r>
       <w:r>
         <w:rPr>
@@ -13613,7 +13763,58 @@
           <w:sz w:val="24"/>
           <w:szCs w:val="24"/>
         </w:rPr>
-        <w:t xml:space="preserve"> pada unit desinfeksi untuk menyisihkan sisa amonia sekaligus menyediakan sisa klor bebas. Nitrifikasi membutuhkan ± 4,57 mg O₂ per mg NH₃-N, sehingga kapasitas penyisihan biologis dibatasi oleh ketersediaan oksigen terlarut. Apabila pemantauan lanjutan menunjukkan amonia secara konsisten berada di atas ± 2 mg/L, diperlukan unit pengolahan biologis pendahuluan tambahan (misalnya biofilter) di luar lingkup perencanaan ini.</w:t>
+        <w:t xml:space="preserve"> pada unit desinfeksi untuk menyisihkan sisa amonia sekaligus menyediakan sisa klor bebas. Kapasitas nitrifikasi dibatasi oleh dua hal. Pertama, nitrifikasi membutuhkan ± 4,57 mg O₂ per mg NH₃-N, sehingga dengan DO keluaran aerasi ± 5,6 mg/L, amonia yang dapat dinitrifikasi paling banyak ± 1,2 mg/L NH₃-N per lintasan. Kedua, setiap 1 mg NH₃-N yang dinitrifikasi menghasilkan 1 mg NO₃-N, sedangkan batas nitrat air minum hanya 4,52 mg/L NO₃-N. Sebaliknya, </w:t>
+      </w:r>
+      <w:r>
+        <w:rPr>
+          <w:rFonts w:ascii="Times New Roman" w:cs="Times New Roman" w:eastAsia="Times New Roman" w:hAnsi="Times New Roman"/>
+          <w:i w:val="1"/>
+          <w:iCs w:val="1"/>
+          <w:sz w:val="24"/>
+          <w:szCs w:val="24"/>
+        </w:rPr>
+        <w:t xml:space="preserve">breakpoint chlorination</w:t>
+      </w:r>
+      <w:r>
+        <w:rPr>
+          <w:rFonts w:ascii="Times New Roman" w:cs="Times New Roman" w:eastAsia="Times New Roman" w:hAnsi="Times New Roman"/>
+          <w:sz w:val="24"/>
+          <w:szCs w:val="24"/>
+        </w:rPr>
+        <w:t xml:space="preserve"> mengubah amonia sebagian besar menjadi gas nitrogen (N₂) sehingga tidak menambah nitrat.</w:t>
+      </w:r>
+    </w:p>
+    <w:p>
+      <w:pPr>
+        <w:spacing w:after="120" w:line="360" w:lineRule="auto"/>
+        <w:ind w:left="720" w:firstLine="720"/>
+        <w:jc w:val="both"/>
+      </w:pPr>
+      <w:r>
+        <w:rPr>
+          <w:rFonts w:ascii="Times New Roman" w:cs="Times New Roman" w:eastAsia="Times New Roman" w:hAnsi="Times New Roman"/>
+          <w:sz w:val="24"/>
+          <w:szCs w:val="24"/>
+        </w:rPr>
+        <w:t xml:space="preserve">Berdasarkan batasan tersebut, amonia desain untuk operasi rutin ditetapkan ± 2 mg/L NH₃-N, mewakili hasil uji Juni 2025 (1,794 mg/L). Pada kondisi ini, ± 1,2 mg/L tersisih melalui nitrifikasi dan sisanya ± 0,8 mg/L melalui </w:t>
+      </w:r>
+      <w:r>
+        <w:rPr>
+          <w:rFonts w:ascii="Times New Roman" w:cs="Times New Roman" w:eastAsia="Times New Roman" w:hAnsi="Times New Roman"/>
+          <w:i w:val="1"/>
+          <w:iCs w:val="1"/>
+          <w:sz w:val="24"/>
+          <w:szCs w:val="24"/>
+        </w:rPr>
+        <w:t xml:space="preserve">breakpoint chlorination</w:t>
+      </w:r>
+      <w:r>
+        <w:rPr>
+          <w:rFonts w:ascii="Times New Roman" w:cs="Times New Roman" w:eastAsia="Times New Roman" w:hAnsi="Times New Roman"/>
+          <w:sz w:val="24"/>
+          <w:szCs w:val="24"/>
+        </w:rPr>
+        <w:t xml:space="preserve"> dengan kebutuhan klor ± 6 mg/L. Nilai 7,742 mg/L diperlakukan sebagai kondisi puncak sesaat; kapasitas klorinator diperiksa terhadap kondisi tersebut pada Bab III dengan memperhatikan risiko pembentukan DBPs. Penambahan biofilter tidak dipilih karena biofilter juga bekerja melalui nitrifikasi, sehingga penyisihan amonia 7,742 mg/L secara biologis akan menghasilkan nitrat ≥ 7,7 mg/L NO₃-N yang melampaui standar air minum. Target amonia air olahan mengacu pada parameter khusus Permenkes 2/2023, yaitu NH₃ ≤ 1,5 mg/L (± 1,23 mg/L NH₃-N), dan kadar amonia di intake dipantau secara rutin sebagai dasar pengaturan dosis klor.</w:t>
       </w:r>
     </w:p>
     <w:p>
@@ -13728,7 +13929,7 @@
           <w:sz w:val="24"/>
           <w:szCs w:val="24"/>
         </w:rPr>
-        <w:t xml:space="preserve">) dengan sumber lain ber-TDS rendah pada jaringan SPAM Kabupaten Badung sebelum didistribusikan. Fraksi maksimum air IPAM Tukad Mati dalam campuran adalah x = (300 − C₂)/(420 − C₂), dengan C₂ adalah TDS sumber pencampur (mg/L). Ketiga, apabila </w:t>
+        <w:t xml:space="preserve">) dengan sumber lain ber-TDS rendah pada jaringan SPAM Kabupaten Badung sebelum didistribusikan. Fraksi maksimum air IPAM Tukad Mati dalam campuran adalah x = (300 − C₂)/(420 − C₂), dengan C₂ adalah TDS sumber pencampur (mg/L). Langkah yang sama juga diperlukan untuk nitrat, yang tidak tersisihkan oleh pengolahan konvensional dan justru bertambah akibat oksidasi nitrit dan nitrifikasi; pada data Juli 2025, nitrat setelah oksidasi nitrit mencapai ± 7 mg/L NO₃-N (± 31 mg/L NO₃), di atas batas 4,52 mg/L NO₃-N. Ketiga, apabila </w:t>
       </w:r>
       <w:r>
         <w:rPr>
@@ -13764,7 +13965,7 @@
           <w:sz w:val="24"/>
           <w:szCs w:val="24"/>
         </w:rPr>
-        <w:t xml:space="preserve">) sebagai pengembangan lanjutan di luar lingkup perencanaan ini. Dengan rejeksi garam 95%, pada TDS 420 mg/L dibutuhkan ± 30% debit produksi (± 150 L/dtk) yang dilewatkan RO, sedangkan pada TDS 1.100 mg/L kebutuhannya naik menjadi ± 77% (± 383 L/dtk). Perbedaan ini menegaskan bahwa penempatan intake di luar zona pasang surut merupakan syarat utama kelayakan sumber. Sebagai pertimbangan, WHO (2022) tidak menetapkan nilai pedoman berbasis kesehatan untuk TDS dan menyatakan bahwa air dengan TDS di bawah ± 600 mg/L umumnya masih dapat diterima dari segi rasa, sehingga pelampauan pada kisaran 420 mg/L terutama berdampak pada aspek estetika, bukan kesehatan.</w:t>
+        <w:t xml:space="preserve">) sebagai pengembangan lanjutan di luar lingkup perencanaan ini; unit RO sekaligus menurunkan nitrat. Dengan rejeksi garam 95%, pada TDS 420 mg/L dibutuhkan ± 30% debit produksi (± 150 L/dtk) yang dilewatkan RO, sedangkan pada TDS 1.100 mg/L kebutuhannya naik menjadi ± 77% (± 383 L/dtk). Perbedaan ini menegaskan bahwa penempatan intake di luar zona pasang surut merupakan syarat utama kelayakan sumber. Sebagai pertimbangan, WHO (2022) tidak menetapkan nilai pedoman berbasis kesehatan untuk TDS dan menyatakan bahwa air dengan TDS di bawah ± 600 mg/L umumnya masih dapat diterima dari segi rasa, sehingga pelampauan pada kisaran 420 mg/L terutama berdampak pada aspek estetika, bukan kesehatan.</w:t>
       </w:r>
     </w:p>
     <w:p>
@@ -14405,7 +14606,7 @@
                 <w:sz w:val="20"/>
                 <w:szCs w:val="20"/>
               </w:rPr>
-              <w:t xml:space="preserve">7,742</w:t>
+              <w:t xml:space="preserve">2 (rutin); 7,742 (puncak)</w:t>
             </w:r>
           </w:p>
         </w:tc>
@@ -14431,7 +14632,7 @@
                 <w:sz w:val="20"/>
                 <w:szCs w:val="20"/>
               </w:rPr>
-              <w:t xml:space="preserve">tersisih hingga breakpoint tercapai</w:t>
+              <w:t xml:space="preserve">NH₃ ≤ 1,5 (≈ 1,23 sbg N)</w:t>
             </w:r>
           </w:p>
         </w:tc>
@@ -14971,7 +15172,7 @@
                 <w:sz w:val="20"/>
                 <w:szCs w:val="20"/>
               </w:rPr>
-              <w:t xml:space="preserve">≤ 3</w:t>
+              <w:t xml:space="preserve">≤ 0,91 (= 3 mg/L NO₂)</w:t>
             </w:r>
           </w:p>
         </w:tc>
@@ -14998,6 +15199,141 @@
                 <w:szCs w:val="20"/>
               </w:rPr>
               <w:t xml:space="preserve">Aerasi, filter biologis, desinfeksi</w:t>
+            </w:r>
+          </w:p>
+        </w:tc>
+      </w:tr>
+      <w:tr>
+        <w:trPr>
+          <w:cantSplit w:val="1"/>
+        </w:trPr>
+        <w:tc>
+          <w:tcPr>
+            <w:tcW w:w="2000" w:type="dxa"/>
+            <w:tcMar>
+              <w:top w:w="50" w:type="dxa"/>
+              <w:left w:w="70" w:type="dxa"/>
+              <w:bottom w:w="50" w:type="dxa"/>
+              <w:right w:w="70" w:type="dxa"/>
+            </w:tcMar>
+            <w:vAlign w:val="center"/>
+          </w:tcPr>
+          <w:p>
+            <w:pPr>
+              <w:spacing w:after="0" w:line="240" w:lineRule="auto"/>
+              <w:jc w:val="left"/>
+            </w:pPr>
+            <w:r>
+              <w:rPr>
+                <w:rFonts w:ascii="Times New Roman" w:cs="Times New Roman" w:eastAsia="Times New Roman" w:hAnsi="Times New Roman"/>
+                <w:sz w:val="20"/>
+                <w:szCs w:val="20"/>
+              </w:rPr>
+              <w:t xml:space="preserve">Nitrat (NO₃-N)</w:t>
+            </w:r>
+          </w:p>
+        </w:tc>
+        <w:tc>
+          <w:tcPr>
+            <w:tcW w:w="1200" w:type="dxa"/>
+            <w:tcMar>
+              <w:top w:w="50" w:type="dxa"/>
+              <w:left w:w="70" w:type="dxa"/>
+              <w:bottom w:w="50" w:type="dxa"/>
+              <w:right w:w="70" w:type="dxa"/>
+            </w:tcMar>
+            <w:vAlign w:val="center"/>
+          </w:tcPr>
+          <w:p>
+            <w:pPr>
+              <w:spacing w:after="0" w:line="240" w:lineRule="auto"/>
+              <w:jc w:val="center"/>
+            </w:pPr>
+            <w:r>
+              <w:rPr>
+                <w:rFonts w:ascii="Times New Roman" w:cs="Times New Roman" w:eastAsia="Times New Roman" w:hAnsi="Times New Roman"/>
+                <w:sz w:val="20"/>
+                <w:szCs w:val="20"/>
+              </w:rPr>
+              <w:t xml:space="preserve">mg/L</w:t>
+            </w:r>
+          </w:p>
+        </w:tc>
+        <w:tc>
+          <w:tcPr>
+            <w:tcW w:w="1600" w:type="dxa"/>
+            <w:tcMar>
+              <w:top w:w="50" w:type="dxa"/>
+              <w:left w:w="70" w:type="dxa"/>
+              <w:bottom w:w="50" w:type="dxa"/>
+              <w:right w:w="70" w:type="dxa"/>
+            </w:tcMar>
+            <w:vAlign w:val="center"/>
+          </w:tcPr>
+          <w:p>
+            <w:pPr>
+              <w:spacing w:after="0" w:line="240" w:lineRule="auto"/>
+              <w:jc w:val="center"/>
+            </w:pPr>
+            <w:r>
+              <w:rPr>
+                <w:rFonts w:ascii="Times New Roman" w:cs="Times New Roman" w:eastAsia="Times New Roman" w:hAnsi="Times New Roman"/>
+                <w:sz w:val="20"/>
+                <w:szCs w:val="20"/>
+              </w:rPr>
+              <w:t xml:space="preserve">5</w:t>
+            </w:r>
+          </w:p>
+        </w:tc>
+        <w:tc>
+          <w:tcPr>
+            <w:tcW w:w="1700" w:type="dxa"/>
+            <w:tcMar>
+              <w:top w:w="50" w:type="dxa"/>
+              <w:left w:w="70" w:type="dxa"/>
+              <w:bottom w:w="50" w:type="dxa"/>
+              <w:right w:w="70" w:type="dxa"/>
+            </w:tcMar>
+            <w:vAlign w:val="center"/>
+          </w:tcPr>
+          <w:p>
+            <w:pPr>
+              <w:spacing w:after="0" w:line="240" w:lineRule="auto"/>
+              <w:jc w:val="center"/>
+            </w:pPr>
+            <w:r>
+              <w:rPr>
+                <w:rFonts w:ascii="Times New Roman" w:cs="Times New Roman" w:eastAsia="Times New Roman" w:hAnsi="Times New Roman"/>
+                <w:sz w:val="20"/>
+                <w:szCs w:val="20"/>
+              </w:rPr>
+              <w:t xml:space="preserve">≤ 4,52 (= 20 mg/L NO₃)</w:t>
+            </w:r>
+          </w:p>
+        </w:tc>
+        <w:tc>
+          <w:tcPr>
+            <w:tcW w:w="2515" w:type="dxa"/>
+            <w:tcMar>
+              <w:top w:w="50" w:type="dxa"/>
+              <w:left w:w="70" w:type="dxa"/>
+              <w:bottom w:w="50" w:type="dxa"/>
+              <w:right w:w="70" w:type="dxa"/>
+            </w:tcMar>
+            <w:vAlign w:val="center"/>
+          </w:tcPr>
+          <w:p>
+            <w:pPr>
+              <w:spacing w:after="0" w:line="240" w:lineRule="auto"/>
+              <w:jc w:val="left"/>
+            </w:pPr>
+            <w:r>
+              <w:rPr>
+                <w:rFonts w:ascii="Times New Roman" w:cs="Times New Roman" w:eastAsia="Times New Roman" w:hAnsi="Times New Roman"/>
+                <w:sz w:val="20"/>
+                <w:szCs w:val="20"/>
+              </w:rPr>
+              <w:t xml:space="preserve">Blending (subbab 2.1.5 c)</w:t>
             </w:r>
           </w:p>
         </w:tc>
@@ -15623,7 +15959,7 @@
           <w:sz w:val="24"/>
           <w:szCs w:val="24"/>
         </w:rPr>
-        <w:t xml:space="preserve">Tukad Mati memiliki luas DAS 39,43 km² dengan panjang sungai utama 22,49 km. Sungai ini tidak memiliki mata air sebagai sumber utama alirannya, sehingga debitnya berasal dari limpasan hujan, aliran dasar (</w:t>
+        <w:t xml:space="preserve">Berdasarkan kajian hidrologi Ardana dkk. (2021), DAS Tukad Mati memiliki luas daerah pengaliran 38,42 km² dengan panjang sungai 18,52 km, sedangkan Kementerian PUPR menyebut luas DAS 39,43 km² dengan panjang sungai utama 22,49 km. Perbedaan ini berasal dari batas delineasi DAS yang digunakan; perhitungan hidrologi dalam perencanaan ini menggunakan data Ardana dkk. (2021) karena bersumber dari kajian hidrologi teknis. Sungai ini tidak memiliki mata air sebagai sumber utama alirannya, sehingga debitnya berasal dari limpasan hujan, aliran dasar (</w:t>
       </w:r>
       <w:r>
         <w:rPr>
@@ -39077,7 +39413,7 @@
           <w:sz w:val="24"/>
           <w:szCs w:val="24"/>
         </w:rPr>
-        <w:t xml:space="preserve">, 13(2), 58–70.</w:t>
+        <w:t xml:space="preserve">, 13(2), 58–70. https://doi.org/10.47329/teknikgradien.v13i2.761</w:t>
       </w:r>
     </w:p>
     <w:p>

</xml_diff>

<commit_message>
PBPAM Bab 2: perhitungan debit dan neraca air
- 2.2.1: debit andalan Tukad Mati diasumsikan 750 L/dtk (perlu verifikasi data terukur)
- 2.2.2: konversi Q produksi, Q air baku, Q internal, Q per jalur ke m3/dtk dan m3/hari
- 2.2.3: pemanfaatan 70%, sisa aliran 225 L/dtk, Tabel 2.7 diisi; neraca proses
  525 = 500 + 25 L/dtk; status surplus bersyarat (Q pemeliharaan + eksisting <= 225)

Co-Authored-By: Claude Opus 5.5 <noreply@anthropic.com>
Claude-Session: https://claude.ai/code/session_01WytFq486GaBDwZ7CZLwu8n
</commit_message>
<xml_diff>
--- a/pbpam/TUBES_PBPAM_Bab2.docx
+++ b/pbpam/TUBES_PBPAM_Bab2.docx
@@ -16022,11 +16022,10 @@
       <w:r>
         <w:rPr>
           <w:rFonts w:ascii="Times New Roman" w:cs="Times New Roman" w:eastAsia="Times New Roman" w:hAnsi="Times New Roman"/>
-          <w:highlight w:val="yellow"/>
-          <w:sz w:val="24"/>
-          <w:szCs w:val="24"/>
-        </w:rPr>
-        <w:t xml:space="preserve">Catatan: data debit Tukad Mati (data pos duga air BWS Bali-Penida atau hasil perhitungan F.J. Mock) belum tersedia dan perlu dilengkapi untuk mengisi nilai Q₉₀ pada Tabel 2.7.</w:t>
+          <w:sz w:val="24"/>
+          <w:szCs w:val="24"/>
+        </w:rPr>
+        <w:t xml:space="preserve">Data debit terukur Tukad Mati dari pos duga air BWS Bali-Penida maupun hasil perhitungan F.J. Mock belum tersedia. Oleh karena itu, debit andalan Tukad Mati dalam perencanaan ini diasumsikan sebesar 750 L/dtk (0,75 m³/dtk). Nilai ini merupakan asumsi perencanaan yang perlu diverifikasi dengan data debit terukur sebelum desain final, karena sungai tanpa mata air seperti Tukad Mati dapat memiliki debit musim kemarau yang jauh lebih kecil.</w:t>
       </w:r>
     </w:p>
     <w:p>
@@ -16078,6 +16077,96 @@
           <w:szCs w:val="24"/>
         </w:rPr>
         <w:t xml:space="preserve">Q air baku = Q produksi × (1 + f) = 500 L/dtk × (1 + 0,05) = 525 L/dtk</w:t>
+      </w:r>
+    </w:p>
+    <w:p>
+      <w:pPr>
+        <w:spacing w:after="120" w:line="360" w:lineRule="auto"/>
+        <w:ind w:left="720" w:firstLine="720"/>
+        <w:jc w:val="both"/>
+      </w:pPr>
+      <w:r>
+        <w:rPr>
+          <w:rFonts w:ascii="Times New Roman" w:cs="Times New Roman" w:eastAsia="Times New Roman" w:hAnsi="Times New Roman"/>
+          <w:sz w:val="24"/>
+          <w:szCs w:val="24"/>
+        </w:rPr>
+        <w:t xml:space="preserve">Dalam satuan volume, debit produksi, debit air baku, kebutuhan internal, dan debit tiap jalur pengolahan dihitung sebagai berikut.</w:t>
+      </w:r>
+    </w:p>
+    <w:p>
+      <w:pPr>
+        <w:spacing w:before="60" w:after="120" w:line="360" w:lineRule="auto"/>
+        <w:ind w:left="720"/>
+        <w:jc w:val="center"/>
+      </w:pPr>
+      <w:r>
+        <w:rPr>
+          <w:rFonts w:ascii="Times New Roman" w:cs="Times New Roman" w:eastAsia="Times New Roman" w:hAnsi="Times New Roman"/>
+          <w:sz w:val="24"/>
+          <w:szCs w:val="24"/>
+        </w:rPr>
+        <w:t xml:space="preserve">Q produksi = 500 L/dtk × 10⁻³ m³/L = 0,5 m³/dtk</w:t>
+      </w:r>
+    </w:p>
+    <w:p>
+      <w:pPr>
+        <w:spacing w:before="60" w:after="120" w:line="360" w:lineRule="auto"/>
+        <w:ind w:left="720"/>
+        <w:jc w:val="center"/>
+      </w:pPr>
+      <w:r>
+        <w:rPr>
+          <w:rFonts w:ascii="Times New Roman" w:cs="Times New Roman" w:eastAsia="Times New Roman" w:hAnsi="Times New Roman"/>
+          <w:sz w:val="24"/>
+          <w:szCs w:val="24"/>
+        </w:rPr>
+        <w:t xml:space="preserve">Q produksi = 0,5 m³/dtk × 86.400 dtk/hari = 43.200 m³/hari</w:t>
+      </w:r>
+    </w:p>
+    <w:p>
+      <w:pPr>
+        <w:spacing w:before="60" w:after="120" w:line="360" w:lineRule="auto"/>
+        <w:ind w:left="720"/>
+        <w:jc w:val="center"/>
+      </w:pPr>
+      <w:r>
+        <w:rPr>
+          <w:rFonts w:ascii="Times New Roman" w:cs="Times New Roman" w:eastAsia="Times New Roman" w:hAnsi="Times New Roman"/>
+          <w:sz w:val="24"/>
+          <w:szCs w:val="24"/>
+        </w:rPr>
+        <w:t xml:space="preserve">Q air baku = 525 L/dtk × 10⁻³ m³/L = 0,525 m³/dtk = 45.360 m³/hari</w:t>
+      </w:r>
+    </w:p>
+    <w:p>
+      <w:pPr>
+        <w:spacing w:before="60" w:after="120" w:line="360" w:lineRule="auto"/>
+        <w:ind w:left="720"/>
+        <w:jc w:val="center"/>
+      </w:pPr>
+      <w:r>
+        <w:rPr>
+          <w:rFonts w:ascii="Times New Roman" w:cs="Times New Roman" w:eastAsia="Times New Roman" w:hAnsi="Times New Roman"/>
+          <w:sz w:val="24"/>
+          <w:szCs w:val="24"/>
+        </w:rPr>
+        <w:t xml:space="preserve">Q internal = Q air baku − Q produksi = 525 L/dtk − 500 L/dtk = 25 L/dtk = 2.160 m³/hari</w:t>
+      </w:r>
+    </w:p>
+    <w:p>
+      <w:pPr>
+        <w:spacing w:before="60" w:after="120" w:line="360" w:lineRule="auto"/>
+        <w:ind w:left="720"/>
+        <w:jc w:val="center"/>
+      </w:pPr>
+      <w:r>
+        <w:rPr>
+          <w:rFonts w:ascii="Times New Roman" w:cs="Times New Roman" w:eastAsia="Times New Roman" w:hAnsi="Times New Roman"/>
+          <w:sz w:val="24"/>
+          <w:szCs w:val="24"/>
+        </w:rPr>
+        <w:t xml:space="preserve">Q per jalur = 525 L/dtk ÷ 2 = 262,5 L/dtk = 22.680 m³/hari</w:t>
       </w:r>
     </w:p>
     <w:p>
@@ -16725,6 +16814,51 @@
     </w:p>
     <w:p>
       <w:pPr>
+        <w:spacing w:after="120" w:line="360" w:lineRule="auto"/>
+        <w:ind w:left="720" w:firstLine="720"/>
+        <w:jc w:val="both"/>
+      </w:pPr>
+      <w:r>
+        <w:rPr>
+          <w:rFonts w:ascii="Times New Roman" w:cs="Times New Roman" w:eastAsia="Times New Roman" w:hAnsi="Times New Roman"/>
+          <w:sz w:val="24"/>
+          <w:szCs w:val="24"/>
+        </w:rPr>
+        <w:t xml:space="preserve">Dengan debit andalan asumsi sebesar 750 L/dtk, tingkat pemanfaatan sungai dan sisa aliran di hilir intake dihitung sebagai berikut.</w:t>
+      </w:r>
+    </w:p>
+    <w:p>
+      <w:pPr>
+        <w:spacing w:before="60" w:after="120" w:line="360" w:lineRule="auto"/>
+        <w:ind w:left="720"/>
+        <w:jc w:val="center"/>
+      </w:pPr>
+      <w:r>
+        <w:rPr>
+          <w:rFonts w:ascii="Times New Roman" w:cs="Times New Roman" w:eastAsia="Times New Roman" w:hAnsi="Times New Roman"/>
+          <w:sz w:val="24"/>
+          <w:szCs w:val="24"/>
+        </w:rPr>
+        <w:t xml:space="preserve">Persentase pemanfaatan = (Q air baku ÷ Q andalan) × 100% = (525 ÷ 750) × 100% = 70%</w:t>
+      </w:r>
+    </w:p>
+    <w:p>
+      <w:pPr>
+        <w:spacing w:before="60" w:after="120" w:line="360" w:lineRule="auto"/>
+        <w:ind w:left="720"/>
+        <w:jc w:val="center"/>
+      </w:pPr>
+      <w:r>
+        <w:rPr>
+          <w:rFonts w:ascii="Times New Roman" w:cs="Times New Roman" w:eastAsia="Times New Roman" w:hAnsi="Times New Roman"/>
+          <w:sz w:val="24"/>
+          <w:szCs w:val="24"/>
+        </w:rPr>
+        <w:t xml:space="preserve">Q sisa = Q andalan − Q air baku = 750 L/dtk − 525 L/dtk = 225 L/dtk</w:t>
+      </w:r>
+    </w:p>
+    <w:p>
+      <w:pPr>
         <w:keepNext w:val="1"/>
         <w:spacing w:before="200" w:after="100" w:line="240" w:lineRule="auto"/>
         <w:jc w:val="center"/>
@@ -16879,7 +17013,7 @@
                 <w:sz w:val="20"/>
                 <w:szCs w:val="20"/>
               </w:rPr>
-              <w:t xml:space="preserve">Debit andalan Q₉₀ musim kemarau</w:t>
+              <w:t xml:space="preserve">Debit andalan Tukad Mati</w:t>
             </w:r>
           </w:p>
         </w:tc>
@@ -16902,11 +17036,10 @@
             <w:r>
               <w:rPr>
                 <w:rFonts w:ascii="Times New Roman" w:cs="Times New Roman" w:eastAsia="Times New Roman" w:hAnsi="Times New Roman"/>
-                <w:highlight w:val="yellow"/>
-                <w:sz w:val="20"/>
-                <w:szCs w:val="20"/>
-              </w:rPr>
-              <w:t xml:space="preserve">.....</w:t>
+                <w:sz w:val="20"/>
+                <w:szCs w:val="20"/>
+              </w:rPr>
+              <w:t xml:space="preserve">750</w:t>
             </w:r>
           </w:p>
         </w:tc>
@@ -16929,11 +17062,10 @@
             <w:r>
               <w:rPr>
                 <w:rFonts w:ascii="Times New Roman" w:cs="Times New Roman" w:eastAsia="Times New Roman" w:hAnsi="Times New Roman"/>
-                <w:highlight w:val="yellow"/>
-                <w:sz w:val="20"/>
-                <w:szCs w:val="20"/>
-              </w:rPr>
-              <w:t xml:space="preserve">Data pos duga air / F.J. Mock</w:t>
+                <w:sz w:val="20"/>
+                <w:szCs w:val="20"/>
+              </w:rPr>
+              <w:t xml:space="preserve">Asumsi perencanaan; diverifikasi dengan data pos duga air / F.J. Mock</w:t>
             </w:r>
           </w:p>
         </w:tc>
@@ -16964,7 +17096,7 @@
                 <w:sz w:val="20"/>
                 <w:szCs w:val="20"/>
               </w:rPr>
-              <w:t xml:space="preserve">Aliran pemeliharaan sungai</w:t>
+              <w:t xml:space="preserve">Kebutuhan air baku IPAM</w:t>
             </w:r>
           </w:p>
         </w:tc>
@@ -16987,11 +17119,10 @@
             <w:r>
               <w:rPr>
                 <w:rFonts w:ascii="Times New Roman" w:cs="Times New Roman" w:eastAsia="Times New Roman" w:hAnsi="Times New Roman"/>
-                <w:highlight w:val="yellow"/>
-                <w:sz w:val="20"/>
-                <w:szCs w:val="20"/>
-              </w:rPr>
-              <w:t xml:space="preserve">.....</w:t>
+                <w:sz w:val="20"/>
+                <w:szCs w:val="20"/>
+              </w:rPr>
+              <w:t xml:space="preserve">525</w:t>
             </w:r>
           </w:p>
         </w:tc>
@@ -17014,11 +17145,10 @@
             <w:r>
               <w:rPr>
                 <w:rFonts w:ascii="Times New Roman" w:cs="Times New Roman" w:eastAsia="Times New Roman" w:hAnsi="Times New Roman"/>
-                <w:highlight w:val="yellow"/>
-                <w:sz w:val="20"/>
-                <w:szCs w:val="20"/>
-              </w:rPr>
-              <w:t xml:space="preserve">Ditetapkan dari data debit</w:t>
+                <w:sz w:val="20"/>
+                <w:szCs w:val="20"/>
+              </w:rPr>
+              <w:t xml:space="preserve">Tabel 2.6</w:t>
             </w:r>
           </w:p>
         </w:tc>
@@ -17049,7 +17179,7 @@
                 <w:sz w:val="20"/>
                 <w:szCs w:val="20"/>
               </w:rPr>
-              <w:t xml:space="preserve">Kebutuhan eksisting (irigasi dan lainnya)</w:t>
+              <w:t xml:space="preserve">Sisa aliran di hilir intake</w:t>
             </w:r>
           </w:p>
         </w:tc>
@@ -17072,11 +17202,10 @@
             <w:r>
               <w:rPr>
                 <w:rFonts w:ascii="Times New Roman" w:cs="Times New Roman" w:eastAsia="Times New Roman" w:hAnsi="Times New Roman"/>
-                <w:highlight w:val="yellow"/>
-                <w:sz w:val="20"/>
-                <w:szCs w:val="20"/>
-              </w:rPr>
-              <w:t xml:space="preserve">.....</w:t>
+                <w:sz w:val="20"/>
+                <w:szCs w:val="20"/>
+              </w:rPr>
+              <w:t xml:space="preserve">225</w:t>
             </w:r>
           </w:p>
         </w:tc>
@@ -17099,11 +17228,10 @@
             <w:r>
               <w:rPr>
                 <w:rFonts w:ascii="Times New Roman" w:cs="Times New Roman" w:eastAsia="Times New Roman" w:hAnsi="Times New Roman"/>
-                <w:highlight w:val="yellow"/>
-                <w:sz w:val="20"/>
-                <w:szCs w:val="20"/>
-              </w:rPr>
-              <w:t xml:space="preserve">Data BWS / Dinas PUPR</w:t>
+                <w:sz w:val="20"/>
+                <w:szCs w:val="20"/>
+              </w:rPr>
+              <w:t xml:space="preserve">750 − 525</w:t>
             </w:r>
           </w:p>
         </w:tc>
@@ -17134,7 +17262,7 @@
                 <w:sz w:val="20"/>
                 <w:szCs w:val="20"/>
               </w:rPr>
-              <w:t xml:space="preserve">Debit tersedia untuk air minum</w:t>
+              <w:t xml:space="preserve">Persentase pemanfaatan</w:t>
             </w:r>
           </w:p>
         </w:tc>
@@ -17157,11 +17285,10 @@
             <w:r>
               <w:rPr>
                 <w:rFonts w:ascii="Times New Roman" w:cs="Times New Roman" w:eastAsia="Times New Roman" w:hAnsi="Times New Roman"/>
-                <w:highlight w:val="yellow"/>
-                <w:sz w:val="20"/>
-                <w:szCs w:val="20"/>
-              </w:rPr>
-              <w:t xml:space="preserve">.....</w:t>
+                <w:sz w:val="20"/>
+                <w:szCs w:val="20"/>
+              </w:rPr>
+              <w:t xml:space="preserve">70%</w:t>
             </w:r>
           </w:p>
         </w:tc>
@@ -17187,7 +17314,7 @@
                 <w:sz w:val="20"/>
                 <w:szCs w:val="20"/>
               </w:rPr>
-              <w:t xml:space="preserve">Q₉₀ − Q pemeliharaan − Q eksisting</w:t>
+              <w:t xml:space="preserve">(525 ÷ 750) × 100%</w:t>
             </w:r>
           </w:p>
         </w:tc>
@@ -17218,7 +17345,7 @@
                 <w:sz w:val="20"/>
                 <w:szCs w:val="20"/>
               </w:rPr>
-              <w:t xml:space="preserve">Kebutuhan air baku IPAM</w:t>
+              <w:t xml:space="preserve">Aliran pemeliharaan + kebutuhan eksisting</w:t>
             </w:r>
           </w:p>
         </w:tc>
@@ -17244,7 +17371,7 @@
                 <w:sz w:val="20"/>
                 <w:szCs w:val="20"/>
               </w:rPr>
-              <w:t xml:space="preserve">525</w:t>
+              <w:t xml:space="preserve">Belum ada data</w:t>
             </w:r>
           </w:p>
         </w:tc>
@@ -17270,7 +17397,7 @@
                 <w:sz w:val="20"/>
                 <w:szCs w:val="20"/>
               </w:rPr>
-              <w:t xml:space="preserve">Tabel 2.6</w:t>
+              <w:t xml:space="preserve">Data BWS Bali-Penida / Dinas PUPR; syarat ≤ 225 L/dtk</w:t>
             </w:r>
           </w:p>
         </w:tc>
@@ -17324,11 +17451,10 @@
             <w:r>
               <w:rPr>
                 <w:rFonts w:ascii="Times New Roman" w:cs="Times New Roman" w:eastAsia="Times New Roman" w:hAnsi="Times New Roman"/>
-                <w:highlight w:val="yellow"/>
-                <w:sz w:val="20"/>
-                <w:szCs w:val="20"/>
-              </w:rPr>
-              <w:t xml:space="preserve">.....</w:t>
+                <w:sz w:val="20"/>
+                <w:szCs w:val="20"/>
+              </w:rPr>
+              <w:t xml:space="preserve">Surplus 225</w:t>
             </w:r>
           </w:p>
         </w:tc>
@@ -17354,7 +17480,7 @@
                 <w:sz w:val="20"/>
                 <w:szCs w:val="20"/>
               </w:rPr>
-              <w:t xml:space="preserve">Surplus/defisit</w:t>
+              <w:t xml:space="preserve">Bersyarat (lihat uraian)</w:t>
             </w:r>
           </w:p>
         </w:tc>
@@ -17389,6 +17515,96 @@
           <w:szCs w:val="24"/>
         </w:rPr>
         <w:t xml:space="preserve">Apabila hasil neraca menunjukkan surplus, pengambilan langsung dari aliran sungai dapat diterapkan. Sebaliknya, apabila terjadi defisit pada bulan-bulan kemarau, diperlukan bangunan peninggi muka air (bendung) atau tampungan untuk menyimpan kelebihan debit musim hujan. Mengingat karakter Tukad Mati sebagai sungai tanpa mata air, ketersediaan pada musim kemarau menjadi aspek kelayakan yang paling menentukan bersama dengan pengaruh pasang surut terhadap TDS.</w:t>
+      </w:r>
+    </w:p>
+    <w:p>
+      <w:pPr>
+        <w:spacing w:after="120" w:line="360" w:lineRule="auto"/>
+        <w:ind w:left="720" w:firstLine="720"/>
+        <w:jc w:val="both"/>
+      </w:pPr>
+      <w:r>
+        <w:rPr>
+          <w:rFonts w:ascii="Times New Roman" w:cs="Times New Roman" w:eastAsia="Times New Roman" w:hAnsi="Times New Roman"/>
+          <w:sz w:val="24"/>
+          <w:szCs w:val="24"/>
+        </w:rPr>
+        <w:t xml:space="preserve">Hasil perhitungan menunjukkan neraca surplus sebesar 225 L/dtk dengan tingkat pemanfaatan 70% dari debit andalan. Status ini bersifat bersyarat karena sisa aliran 225 L/dtk masih harus mencukupi aliran pemeliharaan sungai dan kebutuhan pengguna eksisting di hilir intake, sehingga pengambilan dinyatakan layak apabila Q pemeliharaan + Q eksisting ≤ 225 L/dtk. Tingkat pemanfaatan 70% tergolong tinggi, sehingga verifikasi debit andalan dengan data terukur menjadi prasyarat sebelum desain final.</w:t>
+      </w:r>
+    </w:p>
+    <w:p>
+      <w:pPr>
+        <w:spacing w:after="120" w:line="360" w:lineRule="auto"/>
+        <w:ind w:left="720" w:firstLine="720"/>
+        <w:jc w:val="both"/>
+      </w:pPr>
+      <w:r>
+        <w:rPr>
+          <w:rFonts w:ascii="Times New Roman" w:cs="Times New Roman" w:eastAsia="Times New Roman" w:hAnsi="Times New Roman"/>
+          <w:sz w:val="24"/>
+          <w:szCs w:val="24"/>
+        </w:rPr>
+        <w:t xml:space="preserve">Selain neraca sumber, neraca air pada proses pengolahan disusun untuk memastikan seluruh debit yang masuk ke IPAM telah diperhitungkan, dengan prinsip sebagai berikut.</w:t>
+      </w:r>
+    </w:p>
+    <w:p>
+      <w:pPr>
+        <w:spacing w:before="60" w:after="120" w:line="360" w:lineRule="auto"/>
+        <w:ind w:left="720"/>
+        <w:jc w:val="center"/>
+      </w:pPr>
+      <w:r>
+        <w:rPr>
+          <w:rFonts w:ascii="Times New Roman" w:cs="Times New Roman" w:eastAsia="Times New Roman" w:hAnsi="Times New Roman"/>
+          <w:sz w:val="24"/>
+          <w:szCs w:val="24"/>
+        </w:rPr>
+        <w:t xml:space="preserve">Σ Q masuk = Σ Q keluar</w:t>
+      </w:r>
+    </w:p>
+    <w:p>
+      <w:pPr>
+        <w:spacing w:before="60" w:after="120" w:line="360" w:lineRule="auto"/>
+        <w:ind w:left="720"/>
+        <w:jc w:val="center"/>
+      </w:pPr>
+      <w:r>
+        <w:rPr>
+          <w:rFonts w:ascii="Times New Roman" w:cs="Times New Roman" w:eastAsia="Times New Roman" w:hAnsi="Times New Roman"/>
+          <w:sz w:val="24"/>
+          <w:szCs w:val="24"/>
+        </w:rPr>
+        <w:t xml:space="preserve">Q air baku = Q produksi + Q internal</w:t>
+      </w:r>
+    </w:p>
+    <w:p>
+      <w:pPr>
+        <w:spacing w:before="60" w:after="120" w:line="360" w:lineRule="auto"/>
+        <w:ind w:left="720"/>
+        <w:jc w:val="center"/>
+      </w:pPr>
+      <w:r>
+        <w:rPr>
+          <w:rFonts w:ascii="Times New Roman" w:cs="Times New Roman" w:eastAsia="Times New Roman" w:hAnsi="Times New Roman"/>
+          <w:sz w:val="24"/>
+          <w:szCs w:val="24"/>
+        </w:rPr>
+        <w:t xml:space="preserve">525 L/dtk = 500 L/dtk + 25 L/dtk</w:t>
+      </w:r>
+    </w:p>
+    <w:p>
+      <w:pPr>
+        <w:spacing w:after="120" w:line="360" w:lineRule="auto"/>
+        <w:ind w:left="720" w:firstLine="720"/>
+        <w:jc w:val="both"/>
+      </w:pPr>
+      <w:r>
+        <w:rPr>
+          <w:rFonts w:ascii="Times New Roman" w:cs="Times New Roman" w:eastAsia="Times New Roman" w:hAnsi="Times New Roman"/>
+          <w:sz w:val="24"/>
+          <w:szCs w:val="24"/>
+        </w:rPr>
+        <w:t xml:space="preserve">Kebutuhan internal sebesar 25 L/dtk (5%) digunakan untuk pencucian balik filter, pengurasan lumpur, dan pelarutan bahan kimia. Sebagian air tersebut kembali ke inlet IPAM melalui supernatan gravity thickener, sehingga kehilangan air aktual lebih kecil dari 25 L/dtk; nilai 5% dipertahankan sebagai batas atas perencanaan. Perhitungan rinci neraca massa air dan lumpur disajikan pada Bab IV.</w:t>
       </w:r>
     </w:p>
     <w:p>

</xml_diff>